<commit_message>
PDF vom Word Document gemacht
</commit_message>
<xml_diff>
--- a/documentation/Projektantrag_Kart_and_Key.docx
+++ b/documentation/Projektantrag_Kart_and_Key.docx
@@ -29,23 +29,13 @@
           <w:lang w:val="de-DE"/>
         </w:rPr>
       </w:pPr>
-      <w:proofErr w:type="spellStart"/>
       <w:r>
         <w:rPr>
           <w:sz w:val="40"/>
           <w:szCs w:val="40"/>
           <w:lang w:val="de-DE"/>
         </w:rPr>
-        <w:t>Kart</w:t>
-      </w:r>
-      <w:proofErr w:type="spellEnd"/>
-      <w:r>
-        <w:rPr>
-          <w:sz w:val="40"/>
-          <w:szCs w:val="40"/>
-          <w:lang w:val="de-DE"/>
-        </w:rPr>
-        <w:t xml:space="preserve"> &amp; Key</w:t>
+        <w:t>Kart &amp; Key</w:t>
       </w:r>
     </w:p>
     <w:p>
@@ -131,7 +121,7 @@
           <w:r>
             <w:fldChar w:fldCharType="separate"/>
           </w:r>
-          <w:hyperlink w:anchor="_Toc223085163" w:history="1">
+          <w:hyperlink w:anchor="_Toc223502248" w:history="1">
             <w:r>
               <w:rPr>
                 <w:rStyle w:val="Hyperlink"/>
@@ -159,7 +149,7 @@
                 <w:noProof/>
                 <w:webHidden/>
               </w:rPr>
-              <w:instrText xml:space="preserve"> PAGEREF _Toc223085163 \h </w:instrText>
+              <w:instrText xml:space="preserve"> PAGEREF _Toc223502248 \h </w:instrText>
             </w:r>
             <w:r>
               <w:rPr>
@@ -202,7 +192,7 @@
               <w:lang w:eastAsia="de-AT"/>
             </w:rPr>
           </w:pPr>
-          <w:hyperlink w:anchor="_Toc223085164" w:history="1">
+          <w:hyperlink w:anchor="_Toc223502249" w:history="1">
             <w:r>
               <w:rPr>
                 <w:rStyle w:val="Hyperlink"/>
@@ -230,7 +220,7 @@
                 <w:noProof/>
                 <w:webHidden/>
               </w:rPr>
-              <w:instrText xml:space="preserve"> PAGEREF _Toc223085164 \h </w:instrText>
+              <w:instrText xml:space="preserve"> PAGEREF _Toc223502249 \h </w:instrText>
             </w:r>
             <w:r>
               <w:rPr>
@@ -273,7 +263,7 @@
               <w:lang w:eastAsia="de-AT"/>
             </w:rPr>
           </w:pPr>
-          <w:hyperlink w:anchor="_Toc223085165" w:history="1">
+          <w:hyperlink w:anchor="_Toc223502250" w:history="1">
             <w:r>
               <w:rPr>
                 <w:rStyle w:val="Hyperlink"/>
@@ -300,7 +290,7 @@
                 <w:noProof/>
                 <w:webHidden/>
               </w:rPr>
-              <w:instrText xml:space="preserve"> PAGEREF _Toc223085165 \h </w:instrText>
+              <w:instrText xml:space="preserve"> PAGEREF _Toc223502250 \h </w:instrText>
             </w:r>
             <w:r>
               <w:rPr>
@@ -343,7 +333,7 @@
               <w:lang w:eastAsia="de-AT"/>
             </w:rPr>
           </w:pPr>
-          <w:hyperlink w:anchor="_Toc223085166" w:history="1">
+          <w:hyperlink w:anchor="_Toc223502251" w:history="1">
             <w:r>
               <w:rPr>
                 <w:rStyle w:val="Hyperlink"/>
@@ -371,7 +361,7 @@
                 <w:noProof/>
                 <w:webHidden/>
               </w:rPr>
-              <w:instrText xml:space="preserve"> PAGEREF _Toc223085166 \h </w:instrText>
+              <w:instrText xml:space="preserve"> PAGEREF _Toc223502251 \h </w:instrText>
             </w:r>
             <w:r>
               <w:rPr>
@@ -414,7 +404,7 @@
               <w:lang w:eastAsia="de-AT"/>
             </w:rPr>
           </w:pPr>
-          <w:hyperlink w:anchor="_Toc223085167" w:history="1">
+          <w:hyperlink w:anchor="_Toc223502252" w:history="1">
             <w:r>
               <w:rPr>
                 <w:rStyle w:val="Hyperlink"/>
@@ -442,7 +432,7 @@
                 <w:noProof/>
                 <w:webHidden/>
               </w:rPr>
-              <w:instrText xml:space="preserve"> PAGEREF _Toc223085167 \h </w:instrText>
+              <w:instrText xml:space="preserve"> PAGEREF _Toc223502252 \h </w:instrText>
             </w:r>
             <w:r>
               <w:rPr>
@@ -485,7 +475,7 @@
               <w:lang w:eastAsia="de-AT"/>
             </w:rPr>
           </w:pPr>
-          <w:hyperlink w:anchor="_Toc223085168" w:history="1">
+          <w:hyperlink w:anchor="_Toc223502253" w:history="1">
             <w:r>
               <w:rPr>
                 <w:rStyle w:val="Hyperlink"/>
@@ -513,7 +503,7 @@
                 <w:noProof/>
                 <w:webHidden/>
               </w:rPr>
-              <w:instrText xml:space="preserve"> PAGEREF _Toc223085168 \h </w:instrText>
+              <w:instrText xml:space="preserve"> PAGEREF _Toc223502253 \h </w:instrText>
             </w:r>
             <w:r>
               <w:rPr>
@@ -556,7 +546,7 @@
               <w:lang w:eastAsia="de-AT"/>
             </w:rPr>
           </w:pPr>
-          <w:hyperlink w:anchor="_Toc223085169" w:history="1">
+          <w:hyperlink w:anchor="_Toc223502254" w:history="1">
             <w:r>
               <w:rPr>
                 <w:rStyle w:val="Hyperlink"/>
@@ -584,7 +574,7 @@
                 <w:noProof/>
                 <w:webHidden/>
               </w:rPr>
-              <w:instrText xml:space="preserve"> PAGEREF _Toc223085169 \h </w:instrText>
+              <w:instrText xml:space="preserve"> PAGEREF _Toc223502254 \h </w:instrText>
             </w:r>
             <w:r>
               <w:rPr>
@@ -627,7 +617,7 @@
               <w:lang w:eastAsia="de-AT"/>
             </w:rPr>
           </w:pPr>
-          <w:hyperlink w:anchor="_Toc223085170" w:history="1">
+          <w:hyperlink w:anchor="_Toc223502255" w:history="1">
             <w:r>
               <w:rPr>
                 <w:rStyle w:val="Hyperlink"/>
@@ -655,7 +645,7 @@
                 <w:noProof/>
                 <w:webHidden/>
               </w:rPr>
-              <w:instrText xml:space="preserve"> PAGEREF _Toc223085170 \h </w:instrText>
+              <w:instrText xml:space="preserve"> PAGEREF _Toc223502255 \h </w:instrText>
             </w:r>
             <w:r>
               <w:rPr>
@@ -698,7 +688,7 @@
               <w:lang w:eastAsia="de-AT"/>
             </w:rPr>
           </w:pPr>
-          <w:hyperlink w:anchor="_Toc223085171" w:history="1">
+          <w:hyperlink w:anchor="_Toc223502256" w:history="1">
             <w:r>
               <w:rPr>
                 <w:rStyle w:val="Hyperlink"/>
@@ -726,7 +716,7 @@
                 <w:noProof/>
                 <w:webHidden/>
               </w:rPr>
-              <w:instrText xml:space="preserve"> PAGEREF _Toc223085171 \h </w:instrText>
+              <w:instrText xml:space="preserve"> PAGEREF _Toc223502256 \h </w:instrText>
             </w:r>
             <w:r>
               <w:rPr>
@@ -769,7 +759,7 @@
               <w:lang w:eastAsia="de-AT"/>
             </w:rPr>
           </w:pPr>
-          <w:hyperlink w:anchor="_Toc223085172" w:history="1">
+          <w:hyperlink w:anchor="_Toc223502257" w:history="1">
             <w:r>
               <w:rPr>
                 <w:rStyle w:val="Hyperlink"/>
@@ -804,7 +794,7 @@
                 <w:noProof/>
                 <w:webHidden/>
               </w:rPr>
-              <w:instrText xml:space="preserve"> PAGEREF _Toc223085172 \h </w:instrText>
+              <w:instrText xml:space="preserve"> PAGEREF _Toc223502257 \h </w:instrText>
             </w:r>
             <w:r>
               <w:rPr>
@@ -847,7 +837,7 @@
               <w:lang w:eastAsia="de-AT"/>
             </w:rPr>
           </w:pPr>
-          <w:hyperlink w:anchor="_Toc223085173" w:history="1">
+          <w:hyperlink w:anchor="_Toc223502258" w:history="1">
             <w:r>
               <w:rPr>
                 <w:rStyle w:val="Hyperlink"/>
@@ -874,7 +864,7 @@
                 <w:noProof/>
                 <w:webHidden/>
               </w:rPr>
-              <w:instrText xml:space="preserve"> PAGEREF _Toc223085173 \h </w:instrText>
+              <w:instrText xml:space="preserve"> PAGEREF _Toc223502258 \h </w:instrText>
             </w:r>
             <w:r>
               <w:rPr>
@@ -917,7 +907,7 @@
               <w:lang w:eastAsia="de-AT"/>
             </w:rPr>
           </w:pPr>
-          <w:hyperlink w:anchor="_Toc223085174" w:history="1">
+          <w:hyperlink w:anchor="_Toc223502259" w:history="1">
             <w:r>
               <w:rPr>
                 <w:rStyle w:val="Hyperlink"/>
@@ -944,7 +934,7 @@
                 <w:noProof/>
                 <w:webHidden/>
               </w:rPr>
-              <w:instrText xml:space="preserve"> PAGEREF _Toc223085174 \h </w:instrText>
+              <w:instrText xml:space="preserve"> PAGEREF _Toc223502259 \h </w:instrText>
             </w:r>
             <w:r>
               <w:rPr>
@@ -987,7 +977,7 @@
               <w:lang w:eastAsia="de-AT"/>
             </w:rPr>
           </w:pPr>
-          <w:hyperlink w:anchor="_Toc223085175" w:history="1">
+          <w:hyperlink w:anchor="_Toc223502260" w:history="1">
             <w:r>
               <w:rPr>
                 <w:rStyle w:val="Hyperlink"/>
@@ -1014,7 +1004,7 @@
                 <w:noProof/>
                 <w:webHidden/>
               </w:rPr>
-              <w:instrText xml:space="preserve"> PAGEREF _Toc223085175 \h </w:instrText>
+              <w:instrText xml:space="preserve"> PAGEREF _Toc223502260 \h </w:instrText>
             </w:r>
             <w:r>
               <w:rPr>
@@ -1035,6 +1025,76 @@
                 <w:webHidden/>
               </w:rPr>
               <w:t>6</w:t>
+            </w:r>
+            <w:r>
+              <w:rPr>
+                <w:noProof/>
+                <w:webHidden/>
+              </w:rPr>
+              <w:fldChar w:fldCharType="end"/>
+            </w:r>
+          </w:hyperlink>
+        </w:p>
+        <w:p>
+          <w:pPr>
+            <w:pStyle w:val="Verzeichnis2"/>
+            <w:tabs>
+              <w:tab w:val="right" w:leader="dot" w:pos="9062"/>
+            </w:tabs>
+            <w:rPr>
+              <w:rFonts w:eastAsiaTheme="minorEastAsia"/>
+              <w:noProof/>
+              <w:lang w:eastAsia="de-AT"/>
+            </w:rPr>
+          </w:pPr>
+          <w:hyperlink w:anchor="_Toc223502261" w:history="1">
+            <w:r>
+              <w:rPr>
+                <w:rStyle w:val="Hyperlink"/>
+                <w:noProof/>
+              </w:rPr>
+              <w:t>3. Zielgruppe</w:t>
+            </w:r>
+            <w:r>
+              <w:rPr>
+                <w:noProof/>
+                <w:webHidden/>
+              </w:rPr>
+              <w:tab/>
+            </w:r>
+            <w:r>
+              <w:rPr>
+                <w:noProof/>
+                <w:webHidden/>
+              </w:rPr>
+              <w:fldChar w:fldCharType="begin"/>
+            </w:r>
+            <w:r>
+              <w:rPr>
+                <w:noProof/>
+                <w:webHidden/>
+              </w:rPr>
+              <w:instrText xml:space="preserve"> PAGEREF _Toc223502261 \h </w:instrText>
+            </w:r>
+            <w:r>
+              <w:rPr>
+                <w:noProof/>
+                <w:webHidden/>
+              </w:rPr>
+            </w:r>
+            <w:r>
+              <w:rPr>
+                <w:noProof/>
+                <w:webHidden/>
+              </w:rPr>
+              <w:fldChar w:fldCharType="separate"/>
+            </w:r>
+            <w:r>
+              <w:rPr>
+                <w:noProof/>
+                <w:webHidden/>
+              </w:rPr>
+              <w:t>7</w:t>
             </w:r>
             <w:r>
               <w:rPr>
@@ -1057,13 +1117,13 @@
               <w:lang w:eastAsia="de-AT"/>
             </w:rPr>
           </w:pPr>
-          <w:hyperlink w:anchor="_Toc223085176" w:history="1">
+          <w:hyperlink w:anchor="_Toc223502262" w:history="1">
             <w:r>
               <w:rPr>
                 <w:rStyle w:val="Hyperlink"/>
                 <w:noProof/>
               </w:rPr>
-              <w:t>2.7 Skizze des Spielablaufs</w:t>
+              <w:t>3.1 Altersgruppe</w:t>
             </w:r>
             <w:r>
               <w:rPr>
@@ -1084,77 +1144,7 @@
                 <w:noProof/>
                 <w:webHidden/>
               </w:rPr>
-              <w:instrText xml:space="preserve"> PAGEREF _Toc223085176 \h </w:instrText>
-            </w:r>
-            <w:r>
-              <w:rPr>
-                <w:noProof/>
-                <w:webHidden/>
-              </w:rPr>
-            </w:r>
-            <w:r>
-              <w:rPr>
-                <w:noProof/>
-                <w:webHidden/>
-              </w:rPr>
-              <w:fldChar w:fldCharType="separate"/>
-            </w:r>
-            <w:r>
-              <w:rPr>
-                <w:noProof/>
-                <w:webHidden/>
-              </w:rPr>
-              <w:t>6</w:t>
-            </w:r>
-            <w:r>
-              <w:rPr>
-                <w:noProof/>
-                <w:webHidden/>
-              </w:rPr>
-              <w:fldChar w:fldCharType="end"/>
-            </w:r>
-          </w:hyperlink>
-        </w:p>
-        <w:p>
-          <w:pPr>
-            <w:pStyle w:val="Verzeichnis2"/>
-            <w:tabs>
-              <w:tab w:val="right" w:leader="dot" w:pos="9062"/>
-            </w:tabs>
-            <w:rPr>
-              <w:rFonts w:eastAsiaTheme="minorEastAsia"/>
-              <w:noProof/>
-              <w:lang w:eastAsia="de-AT"/>
-            </w:rPr>
-          </w:pPr>
-          <w:hyperlink w:anchor="_Toc223085177" w:history="1">
-            <w:r>
-              <w:rPr>
-                <w:rStyle w:val="Hyperlink"/>
-                <w:noProof/>
-              </w:rPr>
-              <w:t>3. Zielgruppe</w:t>
-            </w:r>
-            <w:r>
-              <w:rPr>
-                <w:noProof/>
-                <w:webHidden/>
-              </w:rPr>
-              <w:tab/>
-            </w:r>
-            <w:r>
-              <w:rPr>
-                <w:noProof/>
-                <w:webHidden/>
-              </w:rPr>
-              <w:fldChar w:fldCharType="begin"/>
-            </w:r>
-            <w:r>
-              <w:rPr>
-                <w:noProof/>
-                <w:webHidden/>
-              </w:rPr>
-              <w:instrText xml:space="preserve"> PAGEREF _Toc223085177 \h </w:instrText>
+              <w:instrText xml:space="preserve"> PAGEREF _Toc223502262 \h </w:instrText>
             </w:r>
             <w:r>
               <w:rPr>
@@ -1197,13 +1187,13 @@
               <w:lang w:eastAsia="de-AT"/>
             </w:rPr>
           </w:pPr>
-          <w:hyperlink w:anchor="_Toc223085178" w:history="1">
+          <w:hyperlink w:anchor="_Toc223502263" w:history="1">
             <w:r>
               <w:rPr>
                 <w:rStyle w:val="Hyperlink"/>
                 <w:noProof/>
               </w:rPr>
-              <w:t>3.1 Altersgruppe</w:t>
+              <w:t>3.2 Gelegenheitsspieler oder erfahrene Gamer?</w:t>
             </w:r>
             <w:r>
               <w:rPr>
@@ -1224,77 +1214,7 @@
                 <w:noProof/>
                 <w:webHidden/>
               </w:rPr>
-              <w:instrText xml:space="preserve"> PAGEREF _Toc223085178 \h </w:instrText>
-            </w:r>
-            <w:r>
-              <w:rPr>
-                <w:noProof/>
-                <w:webHidden/>
-              </w:rPr>
-            </w:r>
-            <w:r>
-              <w:rPr>
-                <w:noProof/>
-                <w:webHidden/>
-              </w:rPr>
-              <w:fldChar w:fldCharType="separate"/>
-            </w:r>
-            <w:r>
-              <w:rPr>
-                <w:noProof/>
-                <w:webHidden/>
-              </w:rPr>
-              <w:t>7</w:t>
-            </w:r>
-            <w:r>
-              <w:rPr>
-                <w:noProof/>
-                <w:webHidden/>
-              </w:rPr>
-              <w:fldChar w:fldCharType="end"/>
-            </w:r>
-          </w:hyperlink>
-        </w:p>
-        <w:p>
-          <w:pPr>
-            <w:pStyle w:val="Verzeichnis3"/>
-            <w:tabs>
-              <w:tab w:val="right" w:leader="dot" w:pos="9062"/>
-            </w:tabs>
-            <w:rPr>
-              <w:rFonts w:eastAsiaTheme="minorEastAsia"/>
-              <w:noProof/>
-              <w:lang w:eastAsia="de-AT"/>
-            </w:rPr>
-          </w:pPr>
-          <w:hyperlink w:anchor="_Toc223085179" w:history="1">
-            <w:r>
-              <w:rPr>
-                <w:rStyle w:val="Hyperlink"/>
-                <w:noProof/>
-              </w:rPr>
-              <w:t>3.2 Gelegenheitsspieler oder erfahrene Gamer?</w:t>
-            </w:r>
-            <w:r>
-              <w:rPr>
-                <w:noProof/>
-                <w:webHidden/>
-              </w:rPr>
-              <w:tab/>
-            </w:r>
-            <w:r>
-              <w:rPr>
-                <w:noProof/>
-                <w:webHidden/>
-              </w:rPr>
-              <w:fldChar w:fldCharType="begin"/>
-            </w:r>
-            <w:r>
-              <w:rPr>
-                <w:noProof/>
-                <w:webHidden/>
-              </w:rPr>
-              <w:instrText xml:space="preserve"> PAGEREF _Toc223085179 \h </w:instrText>
+              <w:instrText xml:space="preserve"> PAGEREF _Toc223502263 \h </w:instrText>
             </w:r>
             <w:r>
               <w:rPr>
@@ -1361,7 +1281,7 @@
           <w:lang w:val="de-DE"/>
         </w:rPr>
       </w:pPr>
-      <w:bookmarkStart w:id="0" w:name="_Toc223085163"/>
+      <w:bookmarkStart w:id="0" w:name="_Toc223502248"/>
       <w:r>
         <w:rPr>
           <w:lang w:val="de-DE"/>
@@ -1384,7 +1304,7 @@
           <w:lang w:val="de-DE"/>
         </w:rPr>
       </w:pPr>
-      <w:bookmarkStart w:id="1" w:name="_Toc223085164"/>
+      <w:bookmarkStart w:id="1" w:name="_Toc223502249"/>
       <w:r>
         <w:rPr>
           <w:lang w:val="de-DE"/>
@@ -1409,55 +1329,13 @@
         <w:rPr>
           <w:lang w:val="de-DE"/>
         </w:rPr>
-        <w:t>In dem Spiel „</w:t>
-      </w:r>
-      <w:proofErr w:type="spellStart"/>
-      <w:r>
-        <w:rPr>
-          <w:lang w:val="de-DE"/>
-        </w:rPr>
-        <w:t>Kart</w:t>
-      </w:r>
-      <w:proofErr w:type="spellEnd"/>
-      <w:r>
-        <w:rPr>
-          <w:lang w:val="de-DE"/>
-        </w:rPr>
-        <w:t xml:space="preserve"> &amp; Key“ geht es </w:t>
-      </w:r>
-      <w:r>
-        <w:rPr>
-          <w:lang w:val="de-DE"/>
-        </w:rPr>
-        <w:t>darum, dass man aus einem F1/</w:t>
-      </w:r>
-      <w:proofErr w:type="spellStart"/>
-      <w:r>
-        <w:rPr>
-          <w:lang w:val="de-DE"/>
-        </w:rPr>
-        <w:t>Kart</w:t>
-      </w:r>
-      <w:proofErr w:type="spellEnd"/>
-      <w:r>
-        <w:rPr>
-          <w:lang w:val="de-DE"/>
-        </w:rPr>
-        <w:t xml:space="preserve"> Racing </w:t>
-      </w:r>
-      <w:proofErr w:type="spellStart"/>
-      <w:r>
-        <w:rPr>
-          <w:lang w:val="de-DE"/>
-        </w:rPr>
-        <w:t>themed</w:t>
-      </w:r>
-      <w:proofErr w:type="spellEnd"/>
-      <w:r>
-        <w:rPr>
-          <w:lang w:val="de-DE"/>
-        </w:rPr>
-        <w:t xml:space="preserve"> Escape Room ausbricht.</w:t>
+        <w:t xml:space="preserve">In dem Spiel „Kart &amp; Key“ geht es </w:t>
+      </w:r>
+      <w:r>
+        <w:rPr>
+          <w:lang w:val="de-DE"/>
+        </w:rPr>
+        <w:t>darum, dass man aus einem F1/Kart Racing themed Escape Room ausbricht.</w:t>
       </w:r>
       <w:r>
         <w:rPr>
@@ -1567,7 +1445,7 @@
       <w:pPr>
         <w:pStyle w:val="berschrift3"/>
       </w:pPr>
-      <w:bookmarkStart w:id="2" w:name="_Toc223085165"/>
+      <w:bookmarkStart w:id="2" w:name="_Toc223502250"/>
       <w:r>
         <w:t xml:space="preserve">1.2 </w:t>
       </w:r>
@@ -1664,7 +1542,7 @@
           <w:lang w:val="de-DE"/>
         </w:rPr>
       </w:pPr>
-      <w:bookmarkStart w:id="3" w:name="_Toc223085166"/>
+      <w:bookmarkStart w:id="3" w:name="_Toc223502251"/>
       <w:r>
         <w:rPr>
           <w:lang w:val="de-DE"/>
@@ -1701,21 +1579,7 @@
         <w:rPr>
           <w:lang w:val="de-DE"/>
         </w:rPr>
-        <w:t xml:space="preserve">mit dem </w:t>
-      </w:r>
-      <w:proofErr w:type="spellStart"/>
-      <w:r>
-        <w:rPr>
-          <w:lang w:val="de-DE"/>
-        </w:rPr>
-        <w:t>Kart</w:t>
-      </w:r>
-      <w:proofErr w:type="spellEnd"/>
-      <w:r>
-        <w:rPr>
-          <w:lang w:val="de-DE"/>
-        </w:rPr>
-        <w:t xml:space="preserve"> und eins mit dem Formel 1 Auto. Man fährt in den beiden Rennen </w:t>
+        <w:t xml:space="preserve">mit dem Kart und eins mit dem Formel 1 Auto. Man fährt in den beiden Rennen </w:t>
       </w:r>
       <w:r>
         <w:rPr>
@@ -1781,21 +1645,7 @@
         <w:rPr>
           <w:lang w:val="de-DE"/>
         </w:rPr>
-        <w:t xml:space="preserve">ob man gewonnen hat oder nicht im </w:t>
-      </w:r>
-      <w:proofErr w:type="spellStart"/>
-      <w:r>
-        <w:rPr>
-          <w:lang w:val="de-DE"/>
-        </w:rPr>
-        <w:t>Leaderboard</w:t>
-      </w:r>
-      <w:proofErr w:type="spellEnd"/>
-      <w:r>
-        <w:rPr>
-          <w:lang w:val="de-DE"/>
-        </w:rPr>
-        <w:t xml:space="preserve"> eingetragen.</w:t>
+        <w:t>ob man gewonnen hat oder nicht im Leaderboard eingetragen.</w:t>
       </w:r>
       <w:r>
         <w:rPr>
@@ -1818,7 +1668,7 @@
           <w:lang w:val="de-DE"/>
         </w:rPr>
       </w:pPr>
-      <w:bookmarkStart w:id="4" w:name="_Toc223085167"/>
+      <w:bookmarkStart w:id="4" w:name="_Toc223502252"/>
       <w:r>
         <w:rPr>
           <w:lang w:val="de-DE"/>
@@ -1855,16 +1705,8 @@
         <w:rPr>
           <w:lang w:val="de-DE"/>
         </w:rPr>
-        <w:t xml:space="preserve">seine Autos </w:t>
-      </w:r>
-      <w:proofErr w:type="spellStart"/>
-      <w:r>
-        <w:rPr>
-          <w:lang w:val="de-DE"/>
-        </w:rPr>
-        <w:t>auflevelt</w:t>
-      </w:r>
-      <w:proofErr w:type="spellEnd"/>
+        <w:t>seine Autos auflevelt</w:t>
+      </w:r>
       <w:r>
         <w:rPr>
           <w:lang w:val="de-DE"/>
@@ -1900,14 +1742,7 @@
           <w:lang w:val="de-DE"/>
         </w:rPr>
         <w:lastRenderedPageBreak/>
-        <w:t xml:space="preserve">die man </w:t>
-      </w:r>
-      <w:proofErr w:type="spellStart"/>
-      <w:r>
-        <w:rPr>
-          <w:lang w:val="de-DE"/>
-        </w:rPr>
-        <w:t>auflevel</w:t>
+        <w:t>die man auflevel</w:t>
       </w:r>
       <w:r>
         <w:rPr>
@@ -1915,7 +1750,6 @@
         </w:rPr>
         <w:t>n</w:t>
       </w:r>
-      <w:proofErr w:type="spellEnd"/>
       <w:r>
         <w:rPr>
           <w:lang w:val="de-DE"/>
@@ -1980,21 +1814,7 @@
         <w:rPr>
           <w:lang w:val="de-DE"/>
         </w:rPr>
-        <w:t xml:space="preserve">, daher diese ohne </w:t>
-      </w:r>
-      <w:proofErr w:type="spellStart"/>
-      <w:r>
-        <w:rPr>
-          <w:lang w:val="de-DE"/>
-        </w:rPr>
-        <w:t>aufgeleveltes</w:t>
-      </w:r>
-      <w:proofErr w:type="spellEnd"/>
-      <w:r>
-        <w:rPr>
-          <w:lang w:val="de-DE"/>
-        </w:rPr>
-        <w:t xml:space="preserve"> Auto nicht möglich sind zu fahren.</w:t>
+        <w:t>, daher diese ohne aufgeleveltes Auto nicht möglich sind zu fahren.</w:t>
       </w:r>
       <w:r>
         <w:rPr>
@@ -2066,7 +1886,7 @@
           <w:lang w:val="de-DE"/>
         </w:rPr>
       </w:pPr>
-      <w:bookmarkStart w:id="5" w:name="_Toc223085168"/>
+      <w:bookmarkStart w:id="5" w:name="_Toc223502253"/>
       <w:r>
         <w:rPr>
           <w:lang w:val="de-DE"/>
@@ -2123,19 +1943,11 @@
         </w:rPr>
         <w:t xml:space="preserve">man von </w:t>
       </w:r>
-      <w:proofErr w:type="spellStart"/>
-      <w:r>
-        <w:rPr>
-          <w:lang w:val="de-DE"/>
-        </w:rPr>
-        <w:t>von</w:t>
-      </w:r>
-      <w:proofErr w:type="spellEnd"/>
-      <w:r>
-        <w:rPr>
-          <w:lang w:val="de-DE"/>
-        </w:rPr>
-        <w:t xml:space="preserve"> den drei </w:t>
+      <w:r>
+        <w:rPr>
+          <w:lang w:val="de-DE"/>
+        </w:rPr>
+        <w:t xml:space="preserve">von den drei </w:t>
       </w:r>
       <w:r>
         <w:rPr>
@@ -2194,7 +2006,7 @@
           <w:lang w:val="de-DE"/>
         </w:rPr>
       </w:pPr>
-      <w:bookmarkStart w:id="6" w:name="_Toc223085169"/>
+      <w:bookmarkStart w:id="6" w:name="_Toc223502254"/>
       <w:r>
         <w:rPr>
           <w:lang w:val="de-DE"/>
@@ -2217,7 +2029,7 @@
           <w:lang w:val="de-DE"/>
         </w:rPr>
       </w:pPr>
-      <w:bookmarkStart w:id="7" w:name="_Toc223085170"/>
+      <w:bookmarkStart w:id="7" w:name="_Toc223502255"/>
       <w:r>
         <w:rPr>
           <w:lang w:val="de-DE"/>
@@ -2278,21 +2090,7 @@
         <w:rPr>
           <w:lang w:val="de-DE"/>
         </w:rPr>
-        <w:t xml:space="preserve">als „Nicht bewertet“ im </w:t>
-      </w:r>
-      <w:proofErr w:type="spellStart"/>
-      <w:r>
-        <w:rPr>
-          <w:lang w:val="de-DE"/>
-        </w:rPr>
-        <w:t>Leaderboard</w:t>
-      </w:r>
-      <w:proofErr w:type="spellEnd"/>
-      <w:r>
-        <w:rPr>
-          <w:lang w:val="de-DE"/>
-        </w:rPr>
-        <w:t xml:space="preserve"> eingetragen</w:t>
+        <w:t>als „Nicht bewertet“ im Leaderboard eingetragen</w:t>
       </w:r>
       <w:r>
         <w:rPr>
@@ -2321,7 +2119,7 @@
           <w:lang w:val="de-DE"/>
         </w:rPr>
       </w:pPr>
-      <w:bookmarkStart w:id="8" w:name="_Toc223085171"/>
+      <w:bookmarkStart w:id="8" w:name="_Toc223502256"/>
       <w:r>
         <w:rPr>
           <w:lang w:val="de-DE"/>
@@ -2420,7 +2218,7 @@
       <w:pPr>
         <w:pStyle w:val="berschrift3"/>
       </w:pPr>
-      <w:bookmarkStart w:id="9" w:name="_Toc223085172"/>
+      <w:bookmarkStart w:id="9" w:name="_Toc223502257"/>
       <w:r>
         <w:rPr>
           <w:lang w:val="de-DE"/>
@@ -2440,15 +2238,7 @@
         <w:t>Der User kann auf der Spielfläche</w:t>
       </w:r>
       <w:r>
-        <w:t xml:space="preserve"> herumlaufen, wobei sich die </w:t>
-      </w:r>
-      <w:proofErr w:type="spellStart"/>
-      <w:r>
-        <w:t>Map</w:t>
-      </w:r>
-      <w:proofErr w:type="spellEnd"/>
-      <w:r>
-        <w:t xml:space="preserve"> bewegt und nicht </w:t>
+        <w:t xml:space="preserve"> herumlaufen, wobei sich die Map bewegt und nicht </w:t>
       </w:r>
       <w:r>
         <w:t xml:space="preserve">der Spieler. </w:t>
@@ -2559,7 +2349,7 @@
       <w:pPr>
         <w:pStyle w:val="berschrift3"/>
       </w:pPr>
-      <w:bookmarkStart w:id="10" w:name="_Toc223085173"/>
+      <w:bookmarkStart w:id="10" w:name="_Toc223502258"/>
       <w:r>
         <w:t xml:space="preserve">2.4 Herausforderungen, die auf den </w:t>
       </w:r>
@@ -2591,7 +2381,7 @@
       <w:pPr>
         <w:pStyle w:val="berschrift3"/>
       </w:pPr>
-      <w:bookmarkStart w:id="11" w:name="_Toc223085174"/>
+      <w:bookmarkStart w:id="11" w:name="_Toc223502259"/>
       <w:r>
         <w:t xml:space="preserve">2.5 Schwierigkeitsstufen, </w:t>
       </w:r>
@@ -2611,15 +2401,7 @@
         <w:t xml:space="preserve">Schwierigkeitsstufen </w:t>
       </w:r>
       <w:r>
-        <w:t xml:space="preserve">geben, easy, normal und </w:t>
-      </w:r>
-      <w:proofErr w:type="spellStart"/>
-      <w:r>
-        <w:t>hard</w:t>
-      </w:r>
-      <w:proofErr w:type="spellEnd"/>
-      <w:r>
-        <w:t xml:space="preserve">. </w:t>
+        <w:t xml:space="preserve">geben, easy, normal und hard. </w:t>
       </w:r>
       <w:r>
         <w:t xml:space="preserve">Der einzige Unterschied zwischen den </w:t>
@@ -2653,15 +2435,7 @@
       </w:r>
       <w:r>
         <w:br/>
-        <w:t xml:space="preserve">Ein </w:t>
-      </w:r>
-      <w:proofErr w:type="spellStart"/>
-      <w:r>
-        <w:t>Progressionsystem</w:t>
-      </w:r>
-      <w:proofErr w:type="spellEnd"/>
-      <w:r>
-        <w:t xml:space="preserve"> wird es insofern geben, dass man, wenn man nicht eine gewisse </w:t>
+        <w:t xml:space="preserve">Ein Progressionsystem wird es insofern geben, dass man, wenn man nicht eine gewisse </w:t>
       </w:r>
       <w:r>
         <w:t>We</w:t>
@@ -2678,7 +2452,7 @@
       <w:pPr>
         <w:pStyle w:val="berschrift3"/>
       </w:pPr>
-      <w:bookmarkStart w:id="12" w:name="_Toc223085175"/>
+      <w:bookmarkStart w:id="12" w:name="_Toc223502260"/>
       <w:r>
         <w:lastRenderedPageBreak/>
         <w:t xml:space="preserve">2.6 </w:t>
@@ -2727,15 +2501,7 @@
     </w:p>
     <w:p>
       <w:r>
-        <w:t xml:space="preserve">Außerdem gibt es ein Werkstattleistungssystem. Man muss seine Autos verbessern, um genug Werkstattleistung zu bekommen. Ohne diese Punkte kann man bestimmte Rennen – vor allem die Finalrennen – nicht fahren. Das sorgt dafür, dass nicht nur das fahrerische Können zählt, sondern auch die richtige Planung und das richtige </w:t>
-      </w:r>
-      <w:proofErr w:type="spellStart"/>
-      <w:r>
-        <w:t>Aufleveln</w:t>
-      </w:r>
-      <w:proofErr w:type="spellEnd"/>
-      <w:r>
-        <w:t>.</w:t>
+        <w:t>Außerdem gibt es ein Werkstattleistungssystem. Man muss seine Autos verbessern, um genug Werkstattleistung zu bekommen. Ohne diese Punkte kann man bestimmte Rennen – vor allem die Finalrennen – nicht fahren. Das sorgt dafür, dass nicht nur das fahrerische Können zählt, sondern auch die richtige Planung und das richtige Aufleveln.</w:t>
       </w:r>
     </w:p>
     <w:p>
@@ -2748,18 +2514,6 @@
         <w:t>Zusammengefasst ist mein USP also die Mischung aus Rennspiel, Escape-Story, strategischem Upgrade-System und echten F1-Fahrern als zentrale Gegner. Man fährt nicht nur Rennen – man kämpft sich Schritt für Schritt in die Freiheit.</w:t>
       </w:r>
     </w:p>
-    <w:p/>
-    <w:p>
-      <w:pPr>
-        <w:pStyle w:val="berschrift3"/>
-      </w:pPr>
-      <w:bookmarkStart w:id="13" w:name="_Toc223085176"/>
-      <w:r>
-        <w:t>2.7 Skizze des Spielablaufs</w:t>
-      </w:r>
-      <w:bookmarkEnd w:id="13"/>
-    </w:p>
-    <w:p/>
     <w:p>
       <w:r>
         <w:br w:type="page"/>
@@ -2769,50 +2523,50 @@
       <w:pPr>
         <w:pStyle w:val="berschrift2"/>
       </w:pPr>
-      <w:bookmarkStart w:id="14" w:name="_Toc223085177"/>
+      <w:bookmarkStart w:id="13" w:name="_Toc223502261"/>
       <w:r>
         <w:lastRenderedPageBreak/>
         <w:t>3. Zielgruppe</w:t>
       </w:r>
+      <w:bookmarkEnd w:id="13"/>
+    </w:p>
+    <w:p>
+      <w:pPr>
+        <w:pStyle w:val="berschrift3"/>
+      </w:pPr>
+      <w:bookmarkStart w:id="14" w:name="_Toc223502262"/>
+      <w:r>
+        <w:t>3.1 Altersgruppe</w:t>
+      </w:r>
       <w:bookmarkEnd w:id="14"/>
     </w:p>
     <w:p>
+      <w:r>
+        <w:t>Es gibt keine bestimmte Alter</w:t>
+      </w:r>
+      <w:r>
+        <w:t>s</w:t>
+      </w:r>
+      <w:r>
+        <w:t xml:space="preserve">gruppe, die ich mit dem Spiel ansprechen möchte. Das Spiel soll für die Personen sein, die Spaß am Spielen und </w:t>
+      </w:r>
+      <w:r>
+        <w:t xml:space="preserve">an Rennspielen haben. </w:t>
+      </w:r>
+    </w:p>
+    <w:p/>
+    <w:p>
       <w:pPr>
         <w:pStyle w:val="berschrift3"/>
       </w:pPr>
-      <w:bookmarkStart w:id="15" w:name="_Toc223085178"/>
-      <w:r>
-        <w:t>3.1 Altersgruppe</w:t>
+      <w:bookmarkStart w:id="15" w:name="_Toc223502263"/>
+      <w:r>
+        <w:t xml:space="preserve">3.2 </w:t>
+      </w:r>
+      <w:r>
+        <w:t>Gelegenheitsspieler oder erfahrene Gamer?</w:t>
       </w:r>
       <w:bookmarkEnd w:id="15"/>
-    </w:p>
-    <w:p>
-      <w:r>
-        <w:t>Es gibt keine bestimmte Alter</w:t>
-      </w:r>
-      <w:r>
-        <w:t>s</w:t>
-      </w:r>
-      <w:r>
-        <w:t xml:space="preserve">gruppe, die ich mit dem Spiel ansprechen möchte. Das Spiel soll für die Personen sein, die Spaß am Spielen und </w:t>
-      </w:r>
-      <w:r>
-        <w:t xml:space="preserve">an Rennspielen haben. </w:t>
-      </w:r>
-    </w:p>
-    <w:p/>
-    <w:p>
-      <w:pPr>
-        <w:pStyle w:val="berschrift3"/>
-      </w:pPr>
-      <w:bookmarkStart w:id="16" w:name="_Toc223085179"/>
-      <w:r>
-        <w:t xml:space="preserve">3.2 </w:t>
-      </w:r>
-      <w:r>
-        <w:t>Gelegenheitsspieler oder erfahrene Gamer?</w:t>
-      </w:r>
-      <w:bookmarkEnd w:id="16"/>
     </w:p>
     <w:p>
       <w:r>
@@ -3898,6 +3652,7 @@
   <w:style w:type="character" w:default="1" w:styleId="Absatz-Standardschriftart">
     <w:name w:val="Default Paragraph Font"/>
     <w:uiPriority w:val="1"/>
+    <w:semiHidden/>
     <w:unhideWhenUsed/>
   </w:style>
   <w:style w:type="table" w:default="1" w:styleId="NormaleTabelle">
@@ -4564,23 +4319,6 @@
 </file>
 
 <file path=customXml/item1.xml><?xml version="1.0" encoding="utf-8"?>
-<p:properties xmlns:p="http://schemas.microsoft.com/office/2006/metadata/properties" xmlns:xsi="http://www.w3.org/2001/XMLSchema-instance" xmlns:pc="http://schemas.microsoft.com/office/infopath/2007/PartnerControls">
-  <documentManagement>
-    <_activity xmlns="7b437b63-52d4-41a0-b1c2-b4482ef94d86" xsi:nil="true"/>
-  </documentManagement>
-</p:properties>
-</file>
-
-<file path=customXml/item2.xml><?xml version="1.0" encoding="utf-8"?>
-<?mso-contentType ?>
-<FormTemplates xmlns="http://schemas.microsoft.com/sharepoint/v3/contenttype/forms">
-  <Display>DocumentLibraryForm</Display>
-  <Edit>DocumentLibraryForm</Edit>
-  <New>DocumentLibraryForm</New>
-</FormTemplates>
-</file>
-
-<file path=customXml/item3.xml><?xml version="1.0" encoding="utf-8"?>
 <ct:contentTypeSchema xmlns:ct="http://schemas.microsoft.com/office/2006/metadata/contentType" xmlns:ma="http://schemas.microsoft.com/office/2006/metadata/properties/metaAttributes" ct:_="" ma:_="" ma:contentTypeName="Dokument" ma:contentTypeID="0x010100F36E99F46EB3234A89FBCB1FD084F583" ma:contentTypeVersion="12" ma:contentTypeDescription="Ein neues Dokument erstellen." ma:contentTypeScope="" ma:versionID="0125358d4d22a24c07e5806d1f46f453">
   <xsd:schema xmlns:xsd="http://www.w3.org/2001/XMLSchema" xmlns:xs="http://www.w3.org/2001/XMLSchema" xmlns:p="http://schemas.microsoft.com/office/2006/metadata/properties" xmlns:ns3="7b437b63-52d4-41a0-b1c2-b4482ef94d86" targetNamespace="http://schemas.microsoft.com/office/2006/metadata/properties" ma:root="true" ma:fieldsID="b916819ac6b9a1e3d312c80c87cfcc80" ns3:_="">
     <xsd:import namespace="7b437b63-52d4-41a0-b1c2-b4482ef94d86"/>
@@ -4774,25 +4512,24 @@
 </ct:contentTypeSchema>
 </file>
 
-<file path=customXml/itemProps1.xml><?xml version="1.0" encoding="utf-8"?>
-<ds:datastoreItem xmlns:ds="http://schemas.openxmlformats.org/officeDocument/2006/customXml" ds:itemID="{6B530E55-9531-4DB1-AD77-2C4CADC17FAB}">
-  <ds:schemaRefs>
-    <ds:schemaRef ds:uri="http://schemas.microsoft.com/office/2006/metadata/properties"/>
-    <ds:schemaRef ds:uri="http://schemas.microsoft.com/office/infopath/2007/PartnerControls"/>
-    <ds:schemaRef ds:uri="7b437b63-52d4-41a0-b1c2-b4482ef94d86"/>
-  </ds:schemaRefs>
-</ds:datastoreItem>
+<file path=customXml/item2.xml><?xml version="1.0" encoding="utf-8"?>
+<?mso-contentType ?>
+<FormTemplates xmlns="http://schemas.microsoft.com/sharepoint/v3/contenttype/forms">
+  <Display>DocumentLibraryForm</Display>
+  <Edit>DocumentLibraryForm</Edit>
+  <New>DocumentLibraryForm</New>
+</FormTemplates>
 </file>
 
-<file path=customXml/itemProps2.xml><?xml version="1.0" encoding="utf-8"?>
-<ds:datastoreItem xmlns:ds="http://schemas.openxmlformats.org/officeDocument/2006/customXml" ds:itemID="{D79BD08B-393E-4562-B224-3557E4415798}">
-  <ds:schemaRefs>
-    <ds:schemaRef ds:uri="http://schemas.microsoft.com/sharepoint/v3/contenttype/forms"/>
-  </ds:schemaRefs>
-</ds:datastoreItem>
+<file path=customXml/item3.xml><?xml version="1.0" encoding="utf-8"?>
+<p:properties xmlns:p="http://schemas.microsoft.com/office/2006/metadata/properties" xmlns:xsi="http://www.w3.org/2001/XMLSchema-instance" xmlns:pc="http://schemas.microsoft.com/office/infopath/2007/PartnerControls">
+  <documentManagement>
+    <_activity xmlns="7b437b63-52d4-41a0-b1c2-b4482ef94d86" xsi:nil="true"/>
+  </documentManagement>
+</p:properties>
 </file>
 
-<file path=customXml/itemProps3.xml><?xml version="1.0" encoding="utf-8"?>
+<file path=customXml/itemProps1.xml><?xml version="1.0" encoding="utf-8"?>
 <ds:datastoreItem xmlns:ds="http://schemas.openxmlformats.org/officeDocument/2006/customXml" ds:itemID="{2C817786-495D-47BD-B151-4778FCD10AC8}">
   <ds:schemaRefs>
     <ds:schemaRef ds:uri="http://schemas.microsoft.com/office/2006/metadata/contentType"/>
@@ -4808,4 +4545,22 @@
     <ds:schemaRef ds:uri="http://schemas.microsoft.com/internal/obd"/>
   </ds:schemaRefs>
 </ds:datastoreItem>
+</file>
+
+<file path=customXml/itemProps2.xml><?xml version="1.0" encoding="utf-8"?>
+<ds:datastoreItem xmlns:ds="http://schemas.openxmlformats.org/officeDocument/2006/customXml" ds:itemID="{D79BD08B-393E-4562-B224-3557E4415798}">
+  <ds:schemaRefs>
+    <ds:schemaRef ds:uri="http://schemas.microsoft.com/sharepoint/v3/contenttype/forms"/>
+  </ds:schemaRefs>
+</ds:datastoreItem>
+</file>
+
+<file path=customXml/itemProps3.xml><?xml version="1.0" encoding="utf-8"?>
+<ds:datastoreItem xmlns:ds="http://schemas.openxmlformats.org/officeDocument/2006/customXml" ds:itemID="{6B530E55-9531-4DB1-AD77-2C4CADC17FAB}">
+  <ds:schemaRefs>
+    <ds:schemaRef ds:uri="http://schemas.microsoft.com/office/2006/metadata/properties"/>
+    <ds:schemaRef ds:uri="http://schemas.microsoft.com/office/infopath/2007/PartnerControls"/>
+    <ds:schemaRef ds:uri="7b437b63-52d4-41a0-b1c2-b4482ef94d86"/>
+  </ds:schemaRefs>
+</ds:datastoreItem>
 </file>
</xml_diff>

<commit_message>
Erweiterung des Projektes, Gänge hinzugefügt und auf den Dragraces Hindernisse hinzugefügt
</commit_message>
<xml_diff>
--- a/documentation/Projektantrag_Kart_and_Key.docx
+++ b/documentation/Projektantrag_Kart_and_Key.docx
@@ -1992,6 +1992,323 @@
           <w:lang w:val="de-DE"/>
         </w:rPr>
       </w:pPr>
+    </w:p>
+    <w:p>
+      <w:pPr>
+        <w:pStyle w:val="berschrift3"/>
+        <w:rPr>
+          <w:lang w:val="de-DE"/>
+        </w:rPr>
+      </w:pPr>
+      <w:r>
+        <w:rPr>
+          <w:lang w:val="de-DE"/>
+        </w:rPr>
+        <w:t xml:space="preserve">1.6 </w:t>
+      </w:r>
+      <w:r>
+        <w:rPr>
+          <w:lang w:val="de-DE"/>
+        </w:rPr>
+        <w:t>Zusatzfeatures</w:t>
+      </w:r>
+      <w:r>
+        <w:rPr>
+          <w:lang w:val="de-DE"/>
+        </w:rPr>
+        <w:t xml:space="preserve"> (Zusatzpunkt)</w:t>
+      </w:r>
+    </w:p>
+    <w:p>
+      <w:pPr>
+        <w:rPr>
+          <w:lang w:val="de-DE"/>
+        </w:rPr>
+      </w:pPr>
+      <w:r>
+        <w:rPr>
+          <w:lang w:val="de-DE"/>
+        </w:rPr>
+        <w:t>Das Formel 1 Auto hat 7 Vorwärtsgänge. Man startet im Gang ‘N‘ (neutral)</w:t>
+      </w:r>
+      <w:r>
+        <w:rPr>
+          <w:lang w:val="de-DE"/>
+        </w:rPr>
+        <w:t xml:space="preserve">. Mit der Taste ‘E‘ kann man hochschalten und mit der Taste ‘Q‘ runterschalten. </w:t>
+      </w:r>
+      <w:r>
+        <w:rPr>
+          <w:lang w:val="de-DE"/>
+        </w:rPr>
+        <w:t>Das hat den einfachen Grund, dass die Tasten am besten erreichbar sind von ‘W</w:t>
+      </w:r>
+      <w:r>
+        <w:rPr>
+          <w:lang w:val="de-DE"/>
+        </w:rPr>
+        <w:t>‘, ‘</w:t>
+      </w:r>
+      <w:r>
+        <w:rPr>
+          <w:lang w:val="de-DE"/>
+        </w:rPr>
+        <w:t>A</w:t>
+      </w:r>
+      <w:r>
+        <w:rPr>
+          <w:lang w:val="de-DE"/>
+        </w:rPr>
+        <w:t>‘, ‘</w:t>
+      </w:r>
+      <w:r>
+        <w:rPr>
+          <w:lang w:val="de-DE"/>
+        </w:rPr>
+        <w:t>S</w:t>
+      </w:r>
+      <w:r>
+        <w:rPr>
+          <w:lang w:val="de-DE"/>
+        </w:rPr>
+        <w:t>‘, ‘</w:t>
+      </w:r>
+      <w:r>
+        <w:rPr>
+          <w:lang w:val="de-DE"/>
+        </w:rPr>
+        <w:t>D‘ aus</w:t>
+      </w:r>
+      <w:r>
+        <w:rPr>
+          <w:lang w:val="de-DE"/>
+        </w:rPr>
+        <w:t xml:space="preserve">. </w:t>
+      </w:r>
+    </w:p>
+    <w:p>
+      <w:pPr>
+        <w:rPr>
+          <w:lang w:val="de-DE"/>
+        </w:rPr>
+      </w:pPr>
+      <w:r>
+        <w:rPr>
+          <w:lang w:val="de-DE"/>
+        </w:rPr>
+        <w:t>Die Gänge können maximal die Geschwindigkeiten erreichen:</w:t>
+      </w:r>
+    </w:p>
+    <w:p>
+      <w:pPr>
+        <w:rPr>
+          <w:lang w:val="de-DE"/>
+        </w:rPr>
+      </w:pPr>
+      <w:r>
+        <w:rPr>
+          <w:lang w:val="de-DE"/>
+        </w:rPr>
+        <w:t xml:space="preserve">1. Gang: </w:t>
+      </w:r>
+      <w:r>
+        <w:rPr>
+          <w:lang w:val="de-DE"/>
+        </w:rPr>
+        <w:t>10km/h</w:t>
+      </w:r>
+    </w:p>
+    <w:p>
+      <w:pPr>
+        <w:rPr>
+          <w:lang w:val="de-DE"/>
+        </w:rPr>
+      </w:pPr>
+      <w:r>
+        <w:rPr>
+          <w:lang w:val="de-DE"/>
+        </w:rPr>
+        <w:t>2. Gang: 20km/h</w:t>
+      </w:r>
+    </w:p>
+    <w:p>
+      <w:pPr>
+        <w:rPr>
+          <w:lang w:val="de-DE"/>
+        </w:rPr>
+      </w:pPr>
+      <w:r>
+        <w:rPr>
+          <w:lang w:val="de-DE"/>
+        </w:rPr>
+        <w:t>3. Gang: 30km/h</w:t>
+      </w:r>
+    </w:p>
+    <w:p>
+      <w:pPr>
+        <w:rPr>
+          <w:lang w:val="de-DE"/>
+        </w:rPr>
+      </w:pPr>
+      <w:r>
+        <w:rPr>
+          <w:lang w:val="de-DE"/>
+        </w:rPr>
+        <w:t>4. Gang: 40km/h</w:t>
+      </w:r>
+    </w:p>
+    <w:p>
+      <w:pPr>
+        <w:rPr>
+          <w:lang w:val="de-DE"/>
+        </w:rPr>
+      </w:pPr>
+      <w:r>
+        <w:rPr>
+          <w:lang w:val="de-DE"/>
+        </w:rPr>
+        <w:t>5. Gang: 60mk/h</w:t>
+      </w:r>
+    </w:p>
+    <w:p>
+      <w:pPr>
+        <w:rPr>
+          <w:lang w:val="de-DE"/>
+        </w:rPr>
+      </w:pPr>
+      <w:r>
+        <w:rPr>
+          <w:lang w:val="de-DE"/>
+        </w:rPr>
+        <w:t>6. Gang: 80km/h</w:t>
+      </w:r>
+    </w:p>
+    <w:p>
+      <w:pPr>
+        <w:rPr>
+          <w:lang w:val="de-DE"/>
+        </w:rPr>
+      </w:pPr>
+      <w:r>
+        <w:rPr>
+          <w:lang w:val="de-DE"/>
+        </w:rPr>
+        <w:t>7. Gang</w:t>
+      </w:r>
+      <w:r>
+        <w:rPr>
+          <w:lang w:val="de-DE"/>
+        </w:rPr>
+        <w:t>:</w:t>
+      </w:r>
+      <w:r>
+        <w:rPr>
+          <w:lang w:val="de-DE"/>
+        </w:rPr>
+        <w:t xml:space="preserve"> 110km/h</w:t>
+      </w:r>
+    </w:p>
+    <w:p>
+      <w:pPr>
+        <w:rPr>
+          <w:lang w:val="de-DE"/>
+        </w:rPr>
+      </w:pPr>
+    </w:p>
+    <w:p>
+      <w:pPr>
+        <w:rPr>
+          <w:lang w:val="de-DE"/>
+        </w:rPr>
+      </w:pPr>
+      <w:r>
+        <w:rPr>
+          <w:lang w:val="de-DE"/>
+        </w:rPr>
+        <w:t xml:space="preserve">Die Geschwindkeiten </w:t>
+      </w:r>
+      <w:r>
+        <w:rPr>
+          <w:lang w:val="de-DE"/>
+        </w:rPr>
+        <w:t>mögen</w:t>
+      </w:r>
+      <w:r>
+        <w:rPr>
+          <w:lang w:val="de-DE"/>
+        </w:rPr>
+        <w:t xml:space="preserve"> zwar langsam auf dem Bildschirm</w:t>
+      </w:r>
+      <w:r>
+        <w:rPr>
+          <w:lang w:val="de-DE"/>
+        </w:rPr>
+        <w:t xml:space="preserve"> aussehen</w:t>
+      </w:r>
+      <w:r>
+        <w:rPr>
+          <w:lang w:val="de-DE"/>
+        </w:rPr>
+        <w:t xml:space="preserve">, aber wenn man in den Kurven nicht abbremst, fliegt man raus und </w:t>
+      </w:r>
+      <w:r>
+        <w:rPr>
+          <w:lang w:val="de-DE"/>
+        </w:rPr>
+        <w:t>man muss das Rennen erneut starten.</w:t>
+      </w:r>
+    </w:p>
+    <w:p>
+      <w:pPr>
+        <w:rPr>
+          <w:lang w:val="de-DE"/>
+        </w:rPr>
+      </w:pPr>
+    </w:p>
+    <w:p>
+      <w:pPr>
+        <w:pStyle w:val="berschrift3"/>
+        <w:rPr>
+          <w:lang w:val="de-DE"/>
+        </w:rPr>
+      </w:pPr>
+      <w:r>
+        <w:rPr>
+          <w:lang w:val="de-DE"/>
+        </w:rPr>
+        <w:t>1.7 Dragraces (Zusatzpunkt)</w:t>
+      </w:r>
+    </w:p>
+    <w:p>
+      <w:pPr>
+        <w:rPr>
+          <w:lang w:val="de-DE"/>
+        </w:rPr>
+      </w:pPr>
+      <w:r>
+        <w:rPr>
+          <w:lang w:val="de-DE"/>
+        </w:rPr>
+        <w:t xml:space="preserve">Auf den Dragraces werden Hindernisse sein, die es gilt, zu umfahren. Wenn man dies nicht tut und voll auf ein Hindernis drauffährt, muss man </w:t>
+      </w:r>
+      <w:r>
+        <w:rPr>
+          <w:lang w:val="de-DE"/>
+        </w:rPr>
+        <w:t>das Rennen</w:t>
+      </w:r>
+      <w:r>
+        <w:rPr>
+          <w:lang w:val="de-DE"/>
+        </w:rPr>
+        <w:t xml:space="preserve"> neustarten.</w:t>
+      </w:r>
+      <w:r>
+        <w:rPr>
+          <w:lang w:val="de-DE"/>
+        </w:rPr>
+        <w:t xml:space="preserve"> </w:t>
+      </w:r>
       <w:r>
         <w:rPr>
           <w:lang w:val="de-DE"/>
@@ -4319,6 +4636,23 @@
 </file>
 
 <file path=customXml/item1.xml><?xml version="1.0" encoding="utf-8"?>
+<p:properties xmlns:p="http://schemas.microsoft.com/office/2006/metadata/properties" xmlns:xsi="http://www.w3.org/2001/XMLSchema-instance" xmlns:pc="http://schemas.microsoft.com/office/infopath/2007/PartnerControls">
+  <documentManagement>
+    <_activity xmlns="7b437b63-52d4-41a0-b1c2-b4482ef94d86" xsi:nil="true"/>
+  </documentManagement>
+</p:properties>
+</file>
+
+<file path=customXml/item2.xml><?xml version="1.0" encoding="utf-8"?>
+<?mso-contentType ?>
+<FormTemplates xmlns="http://schemas.microsoft.com/sharepoint/v3/contenttype/forms">
+  <Display>DocumentLibraryForm</Display>
+  <Edit>DocumentLibraryForm</Edit>
+  <New>DocumentLibraryForm</New>
+</FormTemplates>
+</file>
+
+<file path=customXml/item3.xml><?xml version="1.0" encoding="utf-8"?>
 <ct:contentTypeSchema xmlns:ct="http://schemas.microsoft.com/office/2006/metadata/contentType" xmlns:ma="http://schemas.microsoft.com/office/2006/metadata/properties/metaAttributes" ct:_="" ma:_="" ma:contentTypeName="Dokument" ma:contentTypeID="0x010100F36E99F46EB3234A89FBCB1FD084F583" ma:contentTypeVersion="12" ma:contentTypeDescription="Ein neues Dokument erstellen." ma:contentTypeScope="" ma:versionID="0125358d4d22a24c07e5806d1f46f453">
   <xsd:schema xmlns:xsd="http://www.w3.org/2001/XMLSchema" xmlns:xs="http://www.w3.org/2001/XMLSchema" xmlns:p="http://schemas.microsoft.com/office/2006/metadata/properties" xmlns:ns3="7b437b63-52d4-41a0-b1c2-b4482ef94d86" targetNamespace="http://schemas.microsoft.com/office/2006/metadata/properties" ma:root="true" ma:fieldsID="b916819ac6b9a1e3d312c80c87cfcc80" ns3:_="">
     <xsd:import namespace="7b437b63-52d4-41a0-b1c2-b4482ef94d86"/>
@@ -4512,24 +4846,25 @@
 </ct:contentTypeSchema>
 </file>
 
-<file path=customXml/item2.xml><?xml version="1.0" encoding="utf-8"?>
-<?mso-contentType ?>
-<FormTemplates xmlns="http://schemas.microsoft.com/sharepoint/v3/contenttype/forms">
-  <Display>DocumentLibraryForm</Display>
-  <Edit>DocumentLibraryForm</Edit>
-  <New>DocumentLibraryForm</New>
-</FormTemplates>
+<file path=customXml/itemProps1.xml><?xml version="1.0" encoding="utf-8"?>
+<ds:datastoreItem xmlns:ds="http://schemas.openxmlformats.org/officeDocument/2006/customXml" ds:itemID="{6B530E55-9531-4DB1-AD77-2C4CADC17FAB}">
+  <ds:schemaRefs>
+    <ds:schemaRef ds:uri="http://schemas.microsoft.com/office/2006/metadata/properties"/>
+    <ds:schemaRef ds:uri="http://schemas.microsoft.com/office/infopath/2007/PartnerControls"/>
+    <ds:schemaRef ds:uri="7b437b63-52d4-41a0-b1c2-b4482ef94d86"/>
+  </ds:schemaRefs>
+</ds:datastoreItem>
 </file>
 
-<file path=customXml/item3.xml><?xml version="1.0" encoding="utf-8"?>
-<p:properties xmlns:p="http://schemas.microsoft.com/office/2006/metadata/properties" xmlns:xsi="http://www.w3.org/2001/XMLSchema-instance" xmlns:pc="http://schemas.microsoft.com/office/infopath/2007/PartnerControls">
-  <documentManagement>
-    <_activity xmlns="7b437b63-52d4-41a0-b1c2-b4482ef94d86" xsi:nil="true"/>
-  </documentManagement>
-</p:properties>
+<file path=customXml/itemProps2.xml><?xml version="1.0" encoding="utf-8"?>
+<ds:datastoreItem xmlns:ds="http://schemas.openxmlformats.org/officeDocument/2006/customXml" ds:itemID="{D79BD08B-393E-4562-B224-3557E4415798}">
+  <ds:schemaRefs>
+    <ds:schemaRef ds:uri="http://schemas.microsoft.com/sharepoint/v3/contenttype/forms"/>
+  </ds:schemaRefs>
+</ds:datastoreItem>
 </file>
 
-<file path=customXml/itemProps1.xml><?xml version="1.0" encoding="utf-8"?>
+<file path=customXml/itemProps3.xml><?xml version="1.0" encoding="utf-8"?>
 <ds:datastoreItem xmlns:ds="http://schemas.openxmlformats.org/officeDocument/2006/customXml" ds:itemID="{2C817786-495D-47BD-B151-4778FCD10AC8}">
   <ds:schemaRefs>
     <ds:schemaRef ds:uri="http://schemas.microsoft.com/office/2006/metadata/contentType"/>
@@ -4545,22 +4880,4 @@
     <ds:schemaRef ds:uri="http://schemas.microsoft.com/internal/obd"/>
   </ds:schemaRefs>
 </ds:datastoreItem>
-</file>
-
-<file path=customXml/itemProps2.xml><?xml version="1.0" encoding="utf-8"?>
-<ds:datastoreItem xmlns:ds="http://schemas.openxmlformats.org/officeDocument/2006/customXml" ds:itemID="{D79BD08B-393E-4562-B224-3557E4415798}">
-  <ds:schemaRefs>
-    <ds:schemaRef ds:uri="http://schemas.microsoft.com/sharepoint/v3/contenttype/forms"/>
-  </ds:schemaRefs>
-</ds:datastoreItem>
-</file>
-
-<file path=customXml/itemProps3.xml><?xml version="1.0" encoding="utf-8"?>
-<ds:datastoreItem xmlns:ds="http://schemas.openxmlformats.org/officeDocument/2006/customXml" ds:itemID="{6B530E55-9531-4DB1-AD77-2C4CADC17FAB}">
-  <ds:schemaRefs>
-    <ds:schemaRef ds:uri="http://schemas.microsoft.com/office/2006/metadata/properties"/>
-    <ds:schemaRef ds:uri="http://schemas.microsoft.com/office/infopath/2007/PartnerControls"/>
-    <ds:schemaRef ds:uri="7b437b63-52d4-41a0-b1c2-b4482ef94d86"/>
-  </ds:schemaRefs>
-</ds:datastoreItem>
 </file>
</xml_diff>

<commit_message>
Im vorherigen Commit vergessen, das Inhaltsverzeichnis zu aktualisieren, hab ich jetzt gemacht
</commit_message>
<xml_diff>
--- a/documentation/Projektantrag_Kart_and_Key.docx
+++ b/documentation/Projektantrag_Kart_and_Key.docx
@@ -121,7 +121,7 @@
           <w:r>
             <w:fldChar w:fldCharType="separate"/>
           </w:r>
-          <w:hyperlink w:anchor="_Toc223502248" w:history="1">
+          <w:hyperlink w:anchor="_Toc223634846" w:history="1">
             <w:r>
               <w:rPr>
                 <w:rStyle w:val="Hyperlink"/>
@@ -149,7 +149,7 @@
                 <w:noProof/>
                 <w:webHidden/>
               </w:rPr>
-              <w:instrText xml:space="preserve"> PAGEREF _Toc223502248 \h </w:instrText>
+              <w:instrText xml:space="preserve"> PAGEREF _Toc223634846 \h </w:instrText>
             </w:r>
             <w:r>
               <w:rPr>
@@ -192,7 +192,7 @@
               <w:lang w:eastAsia="de-AT"/>
             </w:rPr>
           </w:pPr>
-          <w:hyperlink w:anchor="_Toc223502249" w:history="1">
+          <w:hyperlink w:anchor="_Toc223634847" w:history="1">
             <w:r>
               <w:rPr>
                 <w:rStyle w:val="Hyperlink"/>
@@ -220,7 +220,7 @@
                 <w:noProof/>
                 <w:webHidden/>
               </w:rPr>
-              <w:instrText xml:space="preserve"> PAGEREF _Toc223502249 \h </w:instrText>
+              <w:instrText xml:space="preserve"> PAGEREF _Toc223634847 \h </w:instrText>
             </w:r>
             <w:r>
               <w:rPr>
@@ -263,7 +263,7 @@
               <w:lang w:eastAsia="de-AT"/>
             </w:rPr>
           </w:pPr>
-          <w:hyperlink w:anchor="_Toc223502250" w:history="1">
+          <w:hyperlink w:anchor="_Toc223634848" w:history="1">
             <w:r>
               <w:rPr>
                 <w:rStyle w:val="Hyperlink"/>
@@ -290,7 +290,7 @@
                 <w:noProof/>
                 <w:webHidden/>
               </w:rPr>
-              <w:instrText xml:space="preserve"> PAGEREF _Toc223502250 \h </w:instrText>
+              <w:instrText xml:space="preserve"> PAGEREF _Toc223634848 \h </w:instrText>
             </w:r>
             <w:r>
               <w:rPr>
@@ -333,7 +333,7 @@
               <w:lang w:eastAsia="de-AT"/>
             </w:rPr>
           </w:pPr>
-          <w:hyperlink w:anchor="_Toc223502251" w:history="1">
+          <w:hyperlink w:anchor="_Toc223634849" w:history="1">
             <w:r>
               <w:rPr>
                 <w:rStyle w:val="Hyperlink"/>
@@ -361,7 +361,7 @@
                 <w:noProof/>
                 <w:webHidden/>
               </w:rPr>
-              <w:instrText xml:space="preserve"> PAGEREF _Toc223502251 \h </w:instrText>
+              <w:instrText xml:space="preserve"> PAGEREF _Toc223634849 \h </w:instrText>
             </w:r>
             <w:r>
               <w:rPr>
@@ -404,7 +404,7 @@
               <w:lang w:eastAsia="de-AT"/>
             </w:rPr>
           </w:pPr>
-          <w:hyperlink w:anchor="_Toc223502252" w:history="1">
+          <w:hyperlink w:anchor="_Toc223634850" w:history="1">
             <w:r>
               <w:rPr>
                 <w:rStyle w:val="Hyperlink"/>
@@ -432,7 +432,7 @@
                 <w:noProof/>
                 <w:webHidden/>
               </w:rPr>
-              <w:instrText xml:space="preserve"> PAGEREF _Toc223502252 \h </w:instrText>
+              <w:instrText xml:space="preserve"> PAGEREF _Toc223634850 \h </w:instrText>
             </w:r>
             <w:r>
               <w:rPr>
@@ -475,7 +475,7 @@
               <w:lang w:eastAsia="de-AT"/>
             </w:rPr>
           </w:pPr>
-          <w:hyperlink w:anchor="_Toc223502253" w:history="1">
+          <w:hyperlink w:anchor="_Toc223634851" w:history="1">
             <w:r>
               <w:rPr>
                 <w:rStyle w:val="Hyperlink"/>
@@ -503,7 +503,149 @@
                 <w:noProof/>
                 <w:webHidden/>
               </w:rPr>
-              <w:instrText xml:space="preserve"> PAGEREF _Toc223502253 \h </w:instrText>
+              <w:instrText xml:space="preserve"> PAGEREF _Toc223634851 \h </w:instrText>
+            </w:r>
+            <w:r>
+              <w:rPr>
+                <w:noProof/>
+                <w:webHidden/>
+              </w:rPr>
+            </w:r>
+            <w:r>
+              <w:rPr>
+                <w:noProof/>
+                <w:webHidden/>
+              </w:rPr>
+              <w:fldChar w:fldCharType="separate"/>
+            </w:r>
+            <w:r>
+              <w:rPr>
+                <w:noProof/>
+                <w:webHidden/>
+              </w:rPr>
+              <w:t>4</w:t>
+            </w:r>
+            <w:r>
+              <w:rPr>
+                <w:noProof/>
+                <w:webHidden/>
+              </w:rPr>
+              <w:fldChar w:fldCharType="end"/>
+            </w:r>
+          </w:hyperlink>
+        </w:p>
+        <w:p>
+          <w:pPr>
+            <w:pStyle w:val="Verzeichnis3"/>
+            <w:tabs>
+              <w:tab w:val="right" w:leader="dot" w:pos="9062"/>
+            </w:tabs>
+            <w:rPr>
+              <w:rFonts w:eastAsiaTheme="minorEastAsia"/>
+              <w:noProof/>
+              <w:lang w:eastAsia="de-AT"/>
+            </w:rPr>
+          </w:pPr>
+          <w:hyperlink w:anchor="_Toc223634852" w:history="1">
+            <w:r>
+              <w:rPr>
+                <w:rStyle w:val="Hyperlink"/>
+                <w:noProof/>
+                <w:lang w:val="de-DE"/>
+              </w:rPr>
+              <w:t>1.6 Zusatzfeatures (Zusatzpunkt)</w:t>
+            </w:r>
+            <w:r>
+              <w:rPr>
+                <w:noProof/>
+                <w:webHidden/>
+              </w:rPr>
+              <w:tab/>
+            </w:r>
+            <w:r>
+              <w:rPr>
+                <w:noProof/>
+                <w:webHidden/>
+              </w:rPr>
+              <w:fldChar w:fldCharType="begin"/>
+            </w:r>
+            <w:r>
+              <w:rPr>
+                <w:noProof/>
+                <w:webHidden/>
+              </w:rPr>
+              <w:instrText xml:space="preserve"> PAGEREF _Toc223634852 \h </w:instrText>
+            </w:r>
+            <w:r>
+              <w:rPr>
+                <w:noProof/>
+                <w:webHidden/>
+              </w:rPr>
+            </w:r>
+            <w:r>
+              <w:rPr>
+                <w:noProof/>
+                <w:webHidden/>
+              </w:rPr>
+              <w:fldChar w:fldCharType="separate"/>
+            </w:r>
+            <w:r>
+              <w:rPr>
+                <w:noProof/>
+                <w:webHidden/>
+              </w:rPr>
+              <w:t>4</w:t>
+            </w:r>
+            <w:r>
+              <w:rPr>
+                <w:noProof/>
+                <w:webHidden/>
+              </w:rPr>
+              <w:fldChar w:fldCharType="end"/>
+            </w:r>
+          </w:hyperlink>
+        </w:p>
+        <w:p>
+          <w:pPr>
+            <w:pStyle w:val="Verzeichnis3"/>
+            <w:tabs>
+              <w:tab w:val="right" w:leader="dot" w:pos="9062"/>
+            </w:tabs>
+            <w:rPr>
+              <w:rFonts w:eastAsiaTheme="minorEastAsia"/>
+              <w:noProof/>
+              <w:lang w:eastAsia="de-AT"/>
+            </w:rPr>
+          </w:pPr>
+          <w:hyperlink w:anchor="_Toc223634853" w:history="1">
+            <w:r>
+              <w:rPr>
+                <w:rStyle w:val="Hyperlink"/>
+                <w:noProof/>
+                <w:lang w:val="de-DE"/>
+              </w:rPr>
+              <w:t>1.7 Dragraces (Zusatzpunkt)</w:t>
+            </w:r>
+            <w:r>
+              <w:rPr>
+                <w:noProof/>
+                <w:webHidden/>
+              </w:rPr>
+              <w:tab/>
+            </w:r>
+            <w:r>
+              <w:rPr>
+                <w:noProof/>
+                <w:webHidden/>
+              </w:rPr>
+              <w:fldChar w:fldCharType="begin"/>
+            </w:r>
+            <w:r>
+              <w:rPr>
+                <w:noProof/>
+                <w:webHidden/>
+              </w:rPr>
+              <w:instrText xml:space="preserve"> PAGEREF _Toc223634853 \h </w:instrText>
             </w:r>
             <w:r>
               <w:rPr>
@@ -546,7 +688,7 @@
               <w:lang w:eastAsia="de-AT"/>
             </w:rPr>
           </w:pPr>
-          <w:hyperlink w:anchor="_Toc223502254" w:history="1">
+          <w:hyperlink w:anchor="_Toc223634854" w:history="1">
             <w:r>
               <w:rPr>
                 <w:rStyle w:val="Hyperlink"/>
@@ -574,7 +716,7 @@
                 <w:noProof/>
                 <w:webHidden/>
               </w:rPr>
-              <w:instrText xml:space="preserve"> PAGEREF _Toc223502254 \h </w:instrText>
+              <w:instrText xml:space="preserve"> PAGEREF _Toc223634854 \h </w:instrText>
             </w:r>
             <w:r>
               <w:rPr>
@@ -617,7 +759,7 @@
               <w:lang w:eastAsia="de-AT"/>
             </w:rPr>
           </w:pPr>
-          <w:hyperlink w:anchor="_Toc223502255" w:history="1">
+          <w:hyperlink w:anchor="_Toc223634855" w:history="1">
             <w:r>
               <w:rPr>
                 <w:rStyle w:val="Hyperlink"/>
@@ -645,7 +787,7 @@
                 <w:noProof/>
                 <w:webHidden/>
               </w:rPr>
-              <w:instrText xml:space="preserve"> PAGEREF _Toc223502255 \h </w:instrText>
+              <w:instrText xml:space="preserve"> PAGEREF _Toc223634855 \h </w:instrText>
             </w:r>
             <w:r>
               <w:rPr>
@@ -688,7 +830,7 @@
               <w:lang w:eastAsia="de-AT"/>
             </w:rPr>
           </w:pPr>
-          <w:hyperlink w:anchor="_Toc223502256" w:history="1">
+          <w:hyperlink w:anchor="_Toc223634856" w:history="1">
             <w:r>
               <w:rPr>
                 <w:rStyle w:val="Hyperlink"/>
@@ -716,7 +858,7 @@
                 <w:noProof/>
                 <w:webHidden/>
               </w:rPr>
-              <w:instrText xml:space="preserve"> PAGEREF _Toc223502256 \h </w:instrText>
+              <w:instrText xml:space="preserve"> PAGEREF _Toc223634856 \h </w:instrText>
             </w:r>
             <w:r>
               <w:rPr>
@@ -759,7 +901,7 @@
               <w:lang w:eastAsia="de-AT"/>
             </w:rPr>
           </w:pPr>
-          <w:hyperlink w:anchor="_Toc223502257" w:history="1">
+          <w:hyperlink w:anchor="_Toc223634857" w:history="1">
             <w:r>
               <w:rPr>
                 <w:rStyle w:val="Hyperlink"/>
@@ -794,7 +936,7 @@
                 <w:noProof/>
                 <w:webHidden/>
               </w:rPr>
-              <w:instrText xml:space="preserve"> PAGEREF _Toc223502257 \h </w:instrText>
+              <w:instrText xml:space="preserve"> PAGEREF _Toc223634857 \h </w:instrText>
             </w:r>
             <w:r>
               <w:rPr>
@@ -837,7 +979,7 @@
               <w:lang w:eastAsia="de-AT"/>
             </w:rPr>
           </w:pPr>
-          <w:hyperlink w:anchor="_Toc223502258" w:history="1">
+          <w:hyperlink w:anchor="_Toc223634858" w:history="1">
             <w:r>
               <w:rPr>
                 <w:rStyle w:val="Hyperlink"/>
@@ -864,7 +1006,7 @@
                 <w:noProof/>
                 <w:webHidden/>
               </w:rPr>
-              <w:instrText xml:space="preserve"> PAGEREF _Toc223502258 \h </w:instrText>
+              <w:instrText xml:space="preserve"> PAGEREF _Toc223634858 \h </w:instrText>
             </w:r>
             <w:r>
               <w:rPr>
@@ -907,7 +1049,7 @@
               <w:lang w:eastAsia="de-AT"/>
             </w:rPr>
           </w:pPr>
-          <w:hyperlink w:anchor="_Toc223502259" w:history="1">
+          <w:hyperlink w:anchor="_Toc223634859" w:history="1">
             <w:r>
               <w:rPr>
                 <w:rStyle w:val="Hyperlink"/>
@@ -934,7 +1076,7 @@
                 <w:noProof/>
                 <w:webHidden/>
               </w:rPr>
-              <w:instrText xml:space="preserve"> PAGEREF _Toc223502259 \h </w:instrText>
+              <w:instrText xml:space="preserve"> PAGEREF _Toc223634859 \h </w:instrText>
             </w:r>
             <w:r>
               <w:rPr>
@@ -977,7 +1119,7 @@
               <w:lang w:eastAsia="de-AT"/>
             </w:rPr>
           </w:pPr>
-          <w:hyperlink w:anchor="_Toc223502260" w:history="1">
+          <w:hyperlink w:anchor="_Toc223634860" w:history="1">
             <w:r>
               <w:rPr>
                 <w:rStyle w:val="Hyperlink"/>
@@ -1004,7 +1146,7 @@
                 <w:noProof/>
                 <w:webHidden/>
               </w:rPr>
-              <w:instrText xml:space="preserve"> PAGEREF _Toc223502260 \h </w:instrText>
+              <w:instrText xml:space="preserve"> PAGEREF _Toc223634860 \h </w:instrText>
             </w:r>
             <w:r>
               <w:rPr>
@@ -1047,7 +1189,7 @@
               <w:lang w:eastAsia="de-AT"/>
             </w:rPr>
           </w:pPr>
-          <w:hyperlink w:anchor="_Toc223502261" w:history="1">
+          <w:hyperlink w:anchor="_Toc223634861" w:history="1">
             <w:r>
               <w:rPr>
                 <w:rStyle w:val="Hyperlink"/>
@@ -1074,7 +1216,7 @@
                 <w:noProof/>
                 <w:webHidden/>
               </w:rPr>
-              <w:instrText xml:space="preserve"> PAGEREF _Toc223502261 \h </w:instrText>
+              <w:instrText xml:space="preserve"> PAGEREF _Toc223634861 \h </w:instrText>
             </w:r>
             <w:r>
               <w:rPr>
@@ -1117,7 +1259,7 @@
               <w:lang w:eastAsia="de-AT"/>
             </w:rPr>
           </w:pPr>
-          <w:hyperlink w:anchor="_Toc223502262" w:history="1">
+          <w:hyperlink w:anchor="_Toc223634862" w:history="1">
             <w:r>
               <w:rPr>
                 <w:rStyle w:val="Hyperlink"/>
@@ -1144,7 +1286,7 @@
                 <w:noProof/>
                 <w:webHidden/>
               </w:rPr>
-              <w:instrText xml:space="preserve"> PAGEREF _Toc223502262 \h </w:instrText>
+              <w:instrText xml:space="preserve"> PAGEREF _Toc223634862 \h </w:instrText>
             </w:r>
             <w:r>
               <w:rPr>
@@ -1187,7 +1329,7 @@
               <w:lang w:eastAsia="de-AT"/>
             </w:rPr>
           </w:pPr>
-          <w:hyperlink w:anchor="_Toc223502263" w:history="1">
+          <w:hyperlink w:anchor="_Toc223634863" w:history="1">
             <w:r>
               <w:rPr>
                 <w:rStyle w:val="Hyperlink"/>
@@ -1214,7 +1356,7 @@
                 <w:noProof/>
                 <w:webHidden/>
               </w:rPr>
-              <w:instrText xml:space="preserve"> PAGEREF _Toc223502263 \h </w:instrText>
+              <w:instrText xml:space="preserve"> PAGEREF _Toc223634863 \h </w:instrText>
             </w:r>
             <w:r>
               <w:rPr>
@@ -1281,7 +1423,7 @@
           <w:lang w:val="de-DE"/>
         </w:rPr>
       </w:pPr>
-      <w:bookmarkStart w:id="0" w:name="_Toc223502248"/>
+      <w:bookmarkStart w:id="0" w:name="_Toc223634846"/>
       <w:r>
         <w:rPr>
           <w:lang w:val="de-DE"/>
@@ -1304,7 +1446,7 @@
           <w:lang w:val="de-DE"/>
         </w:rPr>
       </w:pPr>
-      <w:bookmarkStart w:id="1" w:name="_Toc223502249"/>
+      <w:bookmarkStart w:id="1" w:name="_Toc223634847"/>
       <w:r>
         <w:rPr>
           <w:lang w:val="de-DE"/>
@@ -1445,7 +1587,7 @@
       <w:pPr>
         <w:pStyle w:val="berschrift3"/>
       </w:pPr>
-      <w:bookmarkStart w:id="2" w:name="_Toc223502250"/>
+      <w:bookmarkStart w:id="2" w:name="_Toc223634848"/>
       <w:r>
         <w:t xml:space="preserve">1.2 </w:t>
       </w:r>
@@ -1542,7 +1684,7 @@
           <w:lang w:val="de-DE"/>
         </w:rPr>
       </w:pPr>
-      <w:bookmarkStart w:id="3" w:name="_Toc223502251"/>
+      <w:bookmarkStart w:id="3" w:name="_Toc223634849"/>
       <w:r>
         <w:rPr>
           <w:lang w:val="de-DE"/>
@@ -1668,7 +1810,7 @@
           <w:lang w:val="de-DE"/>
         </w:rPr>
       </w:pPr>
-      <w:bookmarkStart w:id="4" w:name="_Toc223502252"/>
+      <w:bookmarkStart w:id="4" w:name="_Toc223634850"/>
       <w:r>
         <w:rPr>
           <w:lang w:val="de-DE"/>
@@ -1886,7 +2028,7 @@
           <w:lang w:val="de-DE"/>
         </w:rPr>
       </w:pPr>
-      <w:bookmarkStart w:id="5" w:name="_Toc223502253"/>
+      <w:bookmarkStart w:id="5" w:name="_Toc223634851"/>
       <w:r>
         <w:rPr>
           <w:lang w:val="de-DE"/>
@@ -2000,6 +2142,7 @@
           <w:lang w:val="de-DE"/>
         </w:rPr>
       </w:pPr>
+      <w:bookmarkStart w:id="6" w:name="_Toc223634852"/>
       <w:r>
         <w:rPr>
           <w:lang w:val="de-DE"/>
@@ -2018,6 +2161,7 @@
         </w:rPr>
         <w:t xml:space="preserve"> (Zusatzpunkt)</w:t>
       </w:r>
+      <w:bookmarkEnd w:id="6"/>
     </w:p>
     <w:p>
       <w:pPr>
@@ -2272,12 +2416,14 @@
           <w:lang w:val="de-DE"/>
         </w:rPr>
       </w:pPr>
+      <w:bookmarkStart w:id="7" w:name="_Toc223634853"/>
       <w:r>
         <w:rPr>
           <w:lang w:val="de-DE"/>
         </w:rPr>
         <w:t>1.7 Dragraces (Zusatzpunkt)</w:t>
       </w:r>
+      <w:bookmarkEnd w:id="7"/>
     </w:p>
     <w:p>
       <w:pPr>
@@ -2323,7 +2469,7 @@
           <w:lang w:val="de-DE"/>
         </w:rPr>
       </w:pPr>
-      <w:bookmarkStart w:id="6" w:name="_Toc223502254"/>
+      <w:bookmarkStart w:id="8" w:name="_Toc223634854"/>
       <w:r>
         <w:rPr>
           <w:lang w:val="de-DE"/>
@@ -2337,7 +2483,7 @@
         </w:rPr>
         <w:t>Mechaniken</w:t>
       </w:r>
-      <w:bookmarkEnd w:id="6"/>
+      <w:bookmarkEnd w:id="8"/>
     </w:p>
     <w:p>
       <w:pPr>
@@ -2346,7 +2492,7 @@
           <w:lang w:val="de-DE"/>
         </w:rPr>
       </w:pPr>
-      <w:bookmarkStart w:id="7" w:name="_Toc223502255"/>
+      <w:bookmarkStart w:id="9" w:name="_Toc223634855"/>
       <w:r>
         <w:rPr>
           <w:lang w:val="de-DE"/>
@@ -2359,7 +2505,7 @@
         </w:rPr>
         <w:t>Wie gewinnt oder verliert man?</w:t>
       </w:r>
-      <w:bookmarkEnd w:id="7"/>
+      <w:bookmarkEnd w:id="9"/>
     </w:p>
     <w:p>
       <w:pPr>
@@ -2436,7 +2582,7 @@
           <w:lang w:val="de-DE"/>
         </w:rPr>
       </w:pPr>
-      <w:bookmarkStart w:id="8" w:name="_Toc223502256"/>
+      <w:bookmarkStart w:id="10" w:name="_Toc223634856"/>
       <w:r>
         <w:rPr>
           <w:lang w:val="de-DE"/>
@@ -2449,7 +2595,7 @@
         </w:rPr>
         <w:t>Die grundlegende Spielmechanik</w:t>
       </w:r>
-      <w:bookmarkEnd w:id="8"/>
+      <w:bookmarkEnd w:id="10"/>
     </w:p>
     <w:p>
       <w:pPr>
@@ -2535,7 +2681,7 @@
       <w:pPr>
         <w:pStyle w:val="berschrift3"/>
       </w:pPr>
-      <w:bookmarkStart w:id="9" w:name="_Toc223502257"/>
+      <w:bookmarkStart w:id="11" w:name="_Toc223634857"/>
       <w:r>
         <w:rPr>
           <w:lang w:val="de-DE"/>
@@ -2548,7 +2694,7 @@
       <w:r>
         <w:t>belegung</w:t>
       </w:r>
-      <w:bookmarkEnd w:id="9"/>
+      <w:bookmarkEnd w:id="11"/>
     </w:p>
     <w:p>
       <w:r>
@@ -2666,14 +2812,14 @@
       <w:pPr>
         <w:pStyle w:val="berschrift3"/>
       </w:pPr>
-      <w:bookmarkStart w:id="10" w:name="_Toc223502258"/>
+      <w:bookmarkStart w:id="12" w:name="_Toc223634858"/>
       <w:r>
         <w:t xml:space="preserve">2.4 Herausforderungen, die auf den </w:t>
       </w:r>
       <w:r>
         <w:t>User warten</w:t>
       </w:r>
-      <w:bookmarkEnd w:id="10"/>
+      <w:bookmarkEnd w:id="12"/>
     </w:p>
     <w:p>
       <w:r>
@@ -2698,7 +2844,7 @@
       <w:pPr>
         <w:pStyle w:val="berschrift3"/>
       </w:pPr>
-      <w:bookmarkStart w:id="11" w:name="_Toc223502259"/>
+      <w:bookmarkStart w:id="13" w:name="_Toc223634859"/>
       <w:r>
         <w:t xml:space="preserve">2.5 Schwierigkeitsstufen, </w:t>
       </w:r>
@@ -2708,7 +2854,7 @@
       <w:r>
         <w:t xml:space="preserve"> und Entscheidungen</w:t>
       </w:r>
-      <w:bookmarkEnd w:id="11"/>
+      <w:bookmarkEnd w:id="13"/>
     </w:p>
     <w:p>
       <w:r>
@@ -2769,7 +2915,7 @@
       <w:pPr>
         <w:pStyle w:val="berschrift3"/>
       </w:pPr>
-      <w:bookmarkStart w:id="12" w:name="_Toc223502260"/>
+      <w:bookmarkStart w:id="14" w:name="_Toc223634860"/>
       <w:r>
         <w:lastRenderedPageBreak/>
         <w:t xml:space="preserve">2.6 </w:t>
@@ -2777,7 +2923,7 @@
       <w:r>
         <w:t>USP</w:t>
       </w:r>
-      <w:bookmarkEnd w:id="12"/>
+      <w:bookmarkEnd w:id="14"/>
     </w:p>
     <w:p>
       <w:r>
@@ -2840,22 +2986,22 @@
       <w:pPr>
         <w:pStyle w:val="berschrift2"/>
       </w:pPr>
-      <w:bookmarkStart w:id="13" w:name="_Toc223502261"/>
+      <w:bookmarkStart w:id="15" w:name="_Toc223634861"/>
       <w:r>
         <w:lastRenderedPageBreak/>
         <w:t>3. Zielgruppe</w:t>
       </w:r>
-      <w:bookmarkEnd w:id="13"/>
+      <w:bookmarkEnd w:id="15"/>
     </w:p>
     <w:p>
       <w:pPr>
         <w:pStyle w:val="berschrift3"/>
       </w:pPr>
-      <w:bookmarkStart w:id="14" w:name="_Toc223502262"/>
+      <w:bookmarkStart w:id="16" w:name="_Toc223634862"/>
       <w:r>
         <w:t>3.1 Altersgruppe</w:t>
       </w:r>
-      <w:bookmarkEnd w:id="14"/>
+      <w:bookmarkEnd w:id="16"/>
     </w:p>
     <w:p>
       <w:r>
@@ -2876,14 +3022,14 @@
       <w:pPr>
         <w:pStyle w:val="berschrift3"/>
       </w:pPr>
-      <w:bookmarkStart w:id="15" w:name="_Toc223502263"/>
+      <w:bookmarkStart w:id="17" w:name="_Toc223634863"/>
       <w:r>
         <w:t xml:space="preserve">3.2 </w:t>
       </w:r>
       <w:r>
         <w:t>Gelegenheitsspieler oder erfahrene Gamer?</w:t>
       </w:r>
-      <w:bookmarkEnd w:id="15"/>
+      <w:bookmarkEnd w:id="17"/>
     </w:p>
     <w:p>
       <w:r>
@@ -4636,23 +4782,6 @@
 </file>
 
 <file path=customXml/item1.xml><?xml version="1.0" encoding="utf-8"?>
-<p:properties xmlns:p="http://schemas.microsoft.com/office/2006/metadata/properties" xmlns:xsi="http://www.w3.org/2001/XMLSchema-instance" xmlns:pc="http://schemas.microsoft.com/office/infopath/2007/PartnerControls">
-  <documentManagement>
-    <_activity xmlns="7b437b63-52d4-41a0-b1c2-b4482ef94d86" xsi:nil="true"/>
-  </documentManagement>
-</p:properties>
-</file>
-
-<file path=customXml/item2.xml><?xml version="1.0" encoding="utf-8"?>
-<?mso-contentType ?>
-<FormTemplates xmlns="http://schemas.microsoft.com/sharepoint/v3/contenttype/forms">
-  <Display>DocumentLibraryForm</Display>
-  <Edit>DocumentLibraryForm</Edit>
-  <New>DocumentLibraryForm</New>
-</FormTemplates>
-</file>
-
-<file path=customXml/item3.xml><?xml version="1.0" encoding="utf-8"?>
 <ct:contentTypeSchema xmlns:ct="http://schemas.microsoft.com/office/2006/metadata/contentType" xmlns:ma="http://schemas.microsoft.com/office/2006/metadata/properties/metaAttributes" ct:_="" ma:_="" ma:contentTypeName="Dokument" ma:contentTypeID="0x010100F36E99F46EB3234A89FBCB1FD084F583" ma:contentTypeVersion="12" ma:contentTypeDescription="Ein neues Dokument erstellen." ma:contentTypeScope="" ma:versionID="0125358d4d22a24c07e5806d1f46f453">
   <xsd:schema xmlns:xsd="http://www.w3.org/2001/XMLSchema" xmlns:xs="http://www.w3.org/2001/XMLSchema" xmlns:p="http://schemas.microsoft.com/office/2006/metadata/properties" xmlns:ns3="7b437b63-52d4-41a0-b1c2-b4482ef94d86" targetNamespace="http://schemas.microsoft.com/office/2006/metadata/properties" ma:root="true" ma:fieldsID="b916819ac6b9a1e3d312c80c87cfcc80" ns3:_="">
     <xsd:import namespace="7b437b63-52d4-41a0-b1c2-b4482ef94d86"/>
@@ -4846,25 +4975,24 @@
 </ct:contentTypeSchema>
 </file>
 
-<file path=customXml/itemProps1.xml><?xml version="1.0" encoding="utf-8"?>
-<ds:datastoreItem xmlns:ds="http://schemas.openxmlformats.org/officeDocument/2006/customXml" ds:itemID="{6B530E55-9531-4DB1-AD77-2C4CADC17FAB}">
-  <ds:schemaRefs>
-    <ds:schemaRef ds:uri="http://schemas.microsoft.com/office/2006/metadata/properties"/>
-    <ds:schemaRef ds:uri="http://schemas.microsoft.com/office/infopath/2007/PartnerControls"/>
-    <ds:schemaRef ds:uri="7b437b63-52d4-41a0-b1c2-b4482ef94d86"/>
-  </ds:schemaRefs>
-</ds:datastoreItem>
+<file path=customXml/item2.xml><?xml version="1.0" encoding="utf-8"?>
+<?mso-contentType ?>
+<FormTemplates xmlns="http://schemas.microsoft.com/sharepoint/v3/contenttype/forms">
+  <Display>DocumentLibraryForm</Display>
+  <Edit>DocumentLibraryForm</Edit>
+  <New>DocumentLibraryForm</New>
+</FormTemplates>
 </file>
 
-<file path=customXml/itemProps2.xml><?xml version="1.0" encoding="utf-8"?>
-<ds:datastoreItem xmlns:ds="http://schemas.openxmlformats.org/officeDocument/2006/customXml" ds:itemID="{D79BD08B-393E-4562-B224-3557E4415798}">
-  <ds:schemaRefs>
-    <ds:schemaRef ds:uri="http://schemas.microsoft.com/sharepoint/v3/contenttype/forms"/>
-  </ds:schemaRefs>
-</ds:datastoreItem>
+<file path=customXml/item3.xml><?xml version="1.0" encoding="utf-8"?>
+<p:properties xmlns:p="http://schemas.microsoft.com/office/2006/metadata/properties" xmlns:xsi="http://www.w3.org/2001/XMLSchema-instance" xmlns:pc="http://schemas.microsoft.com/office/infopath/2007/PartnerControls">
+  <documentManagement>
+    <_activity xmlns="7b437b63-52d4-41a0-b1c2-b4482ef94d86" xsi:nil="true"/>
+  </documentManagement>
+</p:properties>
 </file>
 
-<file path=customXml/itemProps3.xml><?xml version="1.0" encoding="utf-8"?>
+<file path=customXml/itemProps1.xml><?xml version="1.0" encoding="utf-8"?>
 <ds:datastoreItem xmlns:ds="http://schemas.openxmlformats.org/officeDocument/2006/customXml" ds:itemID="{2C817786-495D-47BD-B151-4778FCD10AC8}">
   <ds:schemaRefs>
     <ds:schemaRef ds:uri="http://schemas.microsoft.com/office/2006/metadata/contentType"/>
@@ -4880,4 +5008,22 @@
     <ds:schemaRef ds:uri="http://schemas.microsoft.com/internal/obd"/>
   </ds:schemaRefs>
 </ds:datastoreItem>
+</file>
+
+<file path=customXml/itemProps2.xml><?xml version="1.0" encoding="utf-8"?>
+<ds:datastoreItem xmlns:ds="http://schemas.openxmlformats.org/officeDocument/2006/customXml" ds:itemID="{D79BD08B-393E-4562-B224-3557E4415798}">
+  <ds:schemaRefs>
+    <ds:schemaRef ds:uri="http://schemas.microsoft.com/sharepoint/v3/contenttype/forms"/>
+  </ds:schemaRefs>
+</ds:datastoreItem>
+</file>
+
+<file path=customXml/itemProps3.xml><?xml version="1.0" encoding="utf-8"?>
+<ds:datastoreItem xmlns:ds="http://schemas.openxmlformats.org/officeDocument/2006/customXml" ds:itemID="{6B530E55-9531-4DB1-AD77-2C4CADC17FAB}">
+  <ds:schemaRefs>
+    <ds:schemaRef ds:uri="http://schemas.microsoft.com/office/2006/metadata/properties"/>
+    <ds:schemaRef ds:uri="http://schemas.microsoft.com/office/infopath/2007/PartnerControls"/>
+    <ds:schemaRef ds:uri="7b437b63-52d4-41a0-b1c2-b4482ef94d86"/>
+  </ds:schemaRefs>
+</ds:datastoreItem>
 </file>
</xml_diff>